<commit_message>
final for version 2
</commit_message>
<xml_diff>
--- a/_refdoc.docx
+++ b/_refdoc.docx
@@ -307,6 +307,8 @@
       <w:footnotePr>
         <w:numRestart w:val="eachSect"/>
       </w:footnotePr>
+      <w:pgSz w:w="11906" w:h="16838"/>
+      <w:pgMar w:top="1440" w:right="1152" w:bottom="1440" w:left="1152" w:header="708" w:footer="708" w:gutter="0"/>
     </w:sectPr>
   </w:body>
 </w:document>
@@ -1079,31 +1081,35 @@
   <w:style w:type="table" w:default="1" w:styleId="Table">
     <w:name w:val="Table"/>
     <w:basedOn w:val="TableNormal"/>
-    <w:semiHidden/>
-    <w:unhideWhenUsed/>
     <w:qFormat/>
     <w:tblPr>
       <w:tblInd w:w="0" w:type="dxa"/>
+      <w:tblBorders>
+        <w:top w:val="single" w:sz="4" w:space="0" w:color="BFBFBF"/>
+        <w:left w:val="single" w:sz="4" w:space="0" w:color="BFBFBF"/>
+        <w:bottom w:val="single" w:sz="4" w:space="0" w:color="BFBFBF"/>
+        <w:right w:val="single" w:sz="4" w:space="0" w:color="BFBFBF"/>
+        <w:insideH w:val="single" w:sz="4" w:space="0" w:color="BFBFBF"/>
+        <w:insideV w:val="single" w:sz="4" w:space="0" w:color="BFBFBF"/>
+      </w:tblBorders>
       <w:tblCellMar>
-        <w:top w:w="0" w:type="dxa"/>
+        <w:top w:w="36" w:type="dxa"/>
         <w:left w:w="108" w:type="dxa"/>
-        <w:bottom w:w="0" w:type="dxa"/>
+        <w:bottom w:w="36" w:type="dxa"/>
         <w:right w:w="108" w:type="dxa"/>
       </w:tblCellMar>
     </w:tblPr>
     <w:tblStylePr w:type="firstRow">
-      <w:tblPr>
-        <w:jc w:val="left"/>
-        <w:tblInd w:w="0" w:type="dxa"/>
-      </w:tblPr>
-      <w:trPr>
-        <w:jc w:val="left"/>
-      </w:trPr>
+      <w:rPr>
+        <w:b/>
+        <w:color w:val="1F4E79"/>
+      </w:rPr>
       <w:tcPr>
         <w:tcBorders>
-          <w:bottom w:val="single"/>
+          <w:bottom w:val="single" w:sz="8" w:space="0" w:color="2E6DA4"/>
         </w:tcBorders>
-        <w:vAlign w:val="bottom"/>
+        <w:shd w:val="clear" w:color="auto" w:fill="D9E2F3"/>
+        <w:vAlign w:val="center"/>
       </w:tcPr>
     </w:tblStylePr>
   </w:style>

</xml_diff>